<commit_message>
docs: Remove old template placeholder diagrams from sections 2.1 and 2.4
- Removed old CARMA placeholder diagram (image4.jpeg) from section 2.1
- Removed old CARMA placeholder diagram (image5.jpg) from section 2.4
- Removed erroneously duplicated system landscape from section 2.2
- Only new generated diagrams (system landscape + ER) remain
- Updated generate_hld.py to clean adjacent paragraphs when inserting diagrams

Co-Authored-By: Erik Rozi <erik.rozi@cognition.ai>
</commit_message>
<xml_diff>
--- a/documentation/NPSP_High_Level_Design_Document_2026-05-14.docx
+++ b/documentation/NPSP_High_Level_Design_Document_2026-05-14.docx
@@ -5221,47 +5221,6 @@
         <w:rPr>
           <w:noProof/>
         </w:rPr>
-        <w:drawing>
-          <wp:inline distT="0" distB="0" distL="0" distR="0" wp14:anchorId="69BBC29F" wp14:editId="77AD55C7">
-            <wp:extent cx="7143750" cy="2887266"/>
-            <wp:effectExtent l="0" t="0" r="0" b="0"/>
-            <wp:docPr id="1999486742" name="Picture 1999486742"/>
-            <wp:cNvGraphicFramePr>
-              <a:graphicFrameLocks xmlns:a="http://schemas.openxmlformats.org/drawingml/2006/main" noChangeAspect="1"/>
-            </wp:cNvGraphicFramePr>
-            <a:graphic xmlns:a="http://schemas.openxmlformats.org/drawingml/2006/main">
-              <a:graphicData uri="http://schemas.openxmlformats.org/drawingml/2006/picture">
-                <pic:pic xmlns:pic="http://schemas.openxmlformats.org/drawingml/2006/picture">
-                  <pic:nvPicPr>
-                    <pic:cNvPr id="0" name=""/>
-                    <pic:cNvPicPr/>
-                  </pic:nvPicPr>
-                  <pic:blipFill>
-                    <a:blip r:embed="rId28" cstate="print">
-                      <a:extLst>
-                        <a:ext uri="{28A0092B-C50C-407E-A947-70E740481C1C}">
-                          <a14:useLocalDpi xmlns:a14="http://schemas.microsoft.com/office/drawing/2010/main" val="0"/>
-                        </a:ext>
-                      </a:extLst>
-                    </a:blip>
-                    <a:stretch>
-                      <a:fillRect/>
-                    </a:stretch>
-                  </pic:blipFill>
-                  <pic:spPr>
-                    <a:xfrm>
-                      <a:off x="0" y="0"/>
-                      <a:ext cx="7143750" cy="2887266"/>
-                    </a:xfrm>
-                    <a:prstGeom prst="rect">
-                      <a:avLst/>
-                    </a:prstGeom>
-                  </pic:spPr>
-                </pic:pic>
-              </a:graphicData>
-            </a:graphic>
-          </wp:inline>
-        </w:drawing>
       </w:r>
     </w:p>
     <w:p>
@@ -5409,46 +5368,13 @@
       <w:bookmarkStart w:name="_Toc197940018" w:id="40"/>
       <w:bookmarkStart w:name="_Toc142627320" w:id="41"/>
       <w:r>
-        <w:t xml:space="preserve">Response: </w:t>
+        <w:t>Response: See dependent systems table below.</w:t>
       </w:r>
       <w:bookmarkEnd w:id="39"/>
       <w:bookmarkEnd w:id="40"/>
       <w:bookmarkEnd w:id="41"/>
       <w:r/>
-      <w:r>
-        <w:drawing>
-          <wp:inline>
-            <wp:extent cx="5943600" cy="3969104"/>
-            <wp:docPr id="1999486744" name="Picture 1999486744"/>
-            <wp:cNvGraphicFramePr>
-              <a:graphicFrameLocks noChangeAspect="1"/>
-            </wp:cNvGraphicFramePr>
-            <a:graphic>
-              <a:graphicData uri="http://schemas.openxmlformats.org/drawingml/2006/picture">
-                <pic:pic>
-                  <pic:nvPicPr>
-                    <pic:cNvPr id="0" name="system_landscape.png"/>
-                    <pic:cNvPicPr/>
-                  </pic:nvPicPr>
-                  <pic:blipFill>
-                    <a:blip r:embed="rId25"/>
-                    <a:stretch>
-                      <a:fillRect/>
-                    </a:stretch>
-                  </pic:blipFill>
-                  <pic:spPr>
-                    <a:xfrm>
-                      <a:off x="0" y="0"/>
-                      <a:ext cx="5943600" cy="3969104"/>
-                    </a:xfrm>
-                    <a:prstGeom prst="rect"/>
-                  </pic:spPr>
-                </pic:pic>
-              </a:graphicData>
-            </a:graphic>
-          </wp:inline>
-        </w:drawing>
-      </w:r>
+      <w:r/>
     </w:p>
     <w:p/>
     <w:tbl>
@@ -6420,47 +6346,6 @@
         <w:rPr>
           <w:noProof/>
         </w:rPr>
-        <w:drawing>
-          <wp:inline distT="0" distB="0" distL="0" distR="0" wp14:anchorId="4BDE4618" wp14:editId="42AC803E">
-            <wp:extent cx="6858000" cy="5010148"/>
-            <wp:effectExtent l="0" t="0" r="0" b="0"/>
-            <wp:docPr id="1271037021" name="Picture 1271037021"/>
-            <wp:cNvGraphicFramePr>
-              <a:graphicFrameLocks xmlns:a="http://schemas.openxmlformats.org/drawingml/2006/main" noChangeAspect="1"/>
-            </wp:cNvGraphicFramePr>
-            <a:graphic xmlns:a="http://schemas.openxmlformats.org/drawingml/2006/main">
-              <a:graphicData uri="http://schemas.openxmlformats.org/drawingml/2006/picture">
-                <pic:pic xmlns:pic="http://schemas.openxmlformats.org/drawingml/2006/picture">
-                  <pic:nvPicPr>
-                    <pic:cNvPr id="0" name=""/>
-                    <pic:cNvPicPr/>
-                  </pic:nvPicPr>
-                  <pic:blipFill>
-                    <a:blip r:embed="rId32" cstate="print">
-                      <a:extLst>
-                        <a:ext uri="{28A0092B-C50C-407E-A947-70E740481C1C}">
-                          <a14:useLocalDpi xmlns:a14="http://schemas.microsoft.com/office/drawing/2010/main" val="0"/>
-                        </a:ext>
-                      </a:extLst>
-                    </a:blip>
-                    <a:stretch>
-                      <a:fillRect/>
-                    </a:stretch>
-                  </pic:blipFill>
-                  <pic:spPr>
-                    <a:xfrm>
-                      <a:off x="0" y="0"/>
-                      <a:ext cx="6858000" cy="5010148"/>
-                    </a:xfrm>
-                    <a:prstGeom prst="rect">
-                      <a:avLst/>
-                    </a:prstGeom>
-                  </pic:spPr>
-                </pic:pic>
-              </a:graphicData>
-            </a:graphic>
-          </wp:inline>
-        </w:drawing>
       </w:r>
     </w:p>
     <w:p>

</xml_diff>